<commit_message>
Trim MIS5304 report to leave a 247-word buffer under the limit
Co-Authored-By: Claude Opus 5.5 <noreply@anthropic.com>
Claude-Session: https://claude.ai/code/session_01Jv8iy2ZtuQWTjK8oUAVcnN
</commit_message>
<xml_diff>
--- a/MIS5304_Assessment3/MIS5304_A3_Report_Draft.docx
+++ b/MIS5304_Assessment3/MIS5304_A3_Report_Draft.docx
@@ -105,7 +105,7 @@
         <w:jc w:val="center"/>
       </w:pPr>
       <w:r>
-        <w:t xml:space="preserve">Word count: 1,495 including tables (1,275 body text), excluding references and appendix</w:t>
+        <w:t xml:space="preserve">Word count: 1,253 including tables (1,033 body text), excluding references and appendix</w:t>
       </w:r>
     </w:p>
     <w:p>
@@ -126,7 +126,7 @@
         <w:spacing w:after="160" w:line="360"/>
       </w:pPr>
       <w:r>
-        <w:t xml:space="preserve">Between 2022 and 2023, data breaches at Optus, Medibank and Latitude Financial exposed the personal information of millions of Australians and led to regulatory proceedings, making investigative capability a board-level risk. The threat has not eased: in 2024–25 the Australian Signals Directorate (ASD) responded to more than 1,200 cyber security incidents, an 11% increase on the previous year (ASD, 2025). This report critically appraises four categories of cyber investigation tools: security information and event management (SIEM) and log analytics, endpoint detection and response (EDR/XDR), digital forensics and incident response (DFIR) tools, and threat intelligence platforms (TIPs). Each is evaluated against five criteria (coverage, detection accuracy, cost, skills required and integration) for both prevention and incident response, and aligned with the NIST Cybersecurity Framework (CSF) 2.0 (National Institute of Standards and Technology [NIST], 2024). Regulator claims are described as allegations, and no organisation is said to have used a tool unless a source confirms it.</w:t>
+        <w:t xml:space="preserve">Between 2022 and 2023, breaches at Optus, Medibank and Latitude Financial exposed the personal information of millions of Australians and triggered regulatory proceedings, making investigative capability a board-level risk. The threat has not eased: in 2024–25, the Australian Signals Directorate (ASD) responded to more than 1,200 cyber security incidents, an 11% increase on the previous year (ASD, 2025). This report critically appraises four categories of cyber investigation tools: security information and event management (SIEM), endpoint detection and response (EDR/XDR), digital forensics and incident response (DFIR) tools, and threat intelligence platforms (TIPs). Each is evaluated against five criteria for both prevention and incident response, and aligned with the NIST Cybersecurity Framework (CSF) 2.0 (National Institute of Standards and Technology [NIST], 2024). Regulator claims are treated as allegations, and no organisation is said to have used a tool unless a source confirms it.</w:t>
       </w:r>
     </w:p>
     <w:p>
@@ -146,10 +146,10 @@
           <w:b/>
           <w:bCs/>
         </w:rPr>
-        <w:t xml:space="preserve">SIEM and log analytics</w:t>
-      </w:r>
-      <w:r>
-        <w:t xml:space="preserve"> centralise and correlate event logs across networks, identities, applications and cloud services. They underpin ASD’s guidance on centralised logging and threat detection (ASD’s Australian Cyber Security Centre [ACSC] et al., 2024). </w:t>
+        <w:t xml:space="preserve">SIEM</w:t>
+      </w:r>
+      <w:r>
+        <w:t xml:space="preserve"> platforms centralise and correlate logs across networks, identities, applications and cloud services, and underpin ASD’s logging guidance (ASD’s Australian Cyber Security Centre [ACSC] et al., 2024). </w:t>
       </w:r>
       <w:r>
         <w:rPr>
@@ -159,7 +159,7 @@
         <w:t xml:space="preserve">EDR/XDR</w:t>
       </w:r>
       <w:r>
-        <w:t xml:space="preserve"> platforms collect detailed endpoint telemetry, detect malicious behaviour and can isolate hosts; XDR extends this to email, identity and cloud. </w:t>
+        <w:t xml:space="preserve"> collects endpoint telemetry, detects malicious behaviour and isolates hosts; XDR extends this to email, identity and cloud. </w:t>
       </w:r>
       <w:r>
         <w:rPr>
@@ -169,7 +169,7 @@
         <w:t xml:space="preserve">DFIR tools</w:t>
       </w:r>
       <w:r>
-        <w:t xml:space="preserve"> acquire and analyse disk, memory and cloud evidence to reconstruct timelines, establish root cause and determine which data was accessed. </w:t>
+        <w:t xml:space="preserve"> analyse disk, memory and cloud evidence to reconstruct timelines, establish root cause and determine which data was accessed. </w:t>
       </w:r>
       <w:r>
         <w:rPr>
@@ -179,7 +179,7 @@
         <w:t xml:space="preserve">TIPs</w:t>
       </w:r>
       <w:r>
-        <w:t xml:space="preserve"> aggregate and contextualise indicators of compromise and adversary techniques so that defenders can prioritise the threats most relevant to their sector.</w:t>
+        <w:t xml:space="preserve"> contextualise indicators of compromise and adversary techniques so that defenders can prioritise the threats most relevant to their sector.</w:t>
       </w:r>
     </w:p>
     <w:p>
@@ -195,7 +195,7 @@
         <w:spacing w:after="160" w:line="360"/>
       </w:pPr>
       <w:r>
-        <w:t xml:space="preserve">Table 1 summarises the appraisal. SIEM offers the broadest preparatory value because building log coverage exposes blind spots, supporting the CSF Identify (risk assessment) and Detect (continuous monitoring) outcomes. Its weaknesses are cost, which rises with data volume, and accuracy, which depends on continual tuning. In interviews with security operations centre (SOC) analysts, Alahmadi et al. (2022) found that most alarms were perceived as false positives, producing alert fatigue and eroding trust in tools. González-Granadillo et al. (2021) similarly identify integration complexity and skills demand as key barriers to SIEM adoption.</w:t>
+        <w:t xml:space="preserve">Table 1 summarises the appraisal. SIEM offers the broadest preparatory value because building log coverage exposes blind spots, supporting the CSF Identify and Detect functions. However, its cost rises with data volume and its accuracy depends on continual tuning: security operations centre (SOC) analysts interviewed by Alahmadi et al. (2022) perceived most alarms as false positives, producing alert fatigue. González-Granadillo et al. (2021) also identify integration complexity and skills demand as key barriers.</w:t>
       </w:r>
     </w:p>
     <w:p>
@@ -1418,15 +1418,15 @@
         <w:spacing w:after="160" w:line="360"/>
       </w:pPr>
       <w:r>
-        <w:t xml:space="preserve">EDR provides the highest-fidelity endpoint signals and can block known techniques, supporting the Protect function. However, its coverage stops at managed devices, leaving unmanaged contractor machines, application programming interfaces (APIs) and software-as-a-service (SaaS) platforms outside its view. DFIR tools are largely reactive, but they have a preparatory role through forensic readiness: defined log retention, evidence-handling procedures and rehearsed playbooks. Their main constraint is scarce specialist skills, which many organisations obtain through external retainers. TIPs can make risk assessment more relevant to the organisation, but without mature analysts to act on them they add noise rather than insight, which makes them the least suitable first investment. Their value also depends on sharing relationships, such as ASD’s Cyber Threat Intelligence Sharing platform.</w:t>
-      </w:r>
-    </w:p>
-    <w:p>
-      <w:pPr>
-        <w:spacing w:after="160" w:line="360"/>
-      </w:pPr>
-      <w:r>
-        <w:t xml:space="preserve">Figure 1 maps each category to the six CSF 2.0 functions. No single tool spans the framework, and none addresses Govern directly. Tools therefore complement, rather than replace, baseline controls such as ASD’s Essential Eight, including multi-factor authentication (MFA; ASD, 2023).</w:t>
+        <w:t xml:space="preserve">EDR provides high-fidelity endpoint signals and blocks known techniques, supporting the Protect function, but it cannot see unmanaged contractor devices, application programming interfaces (APIs) or software-as-a-service (SaaS) platforms. DFIR tools are mainly reactive, yet they support preparation through forensic readiness: defined log retention, evidence-handling procedures and rehearsed playbooks. Their main constraint is scarce specialist skills, which are often obtained through external retainers. TIPs can make risk assessment more relevant, but without mature analysts to act on them they add noise rather than insight, making them the least suitable first investment.</w:t>
+      </w:r>
+    </w:p>
+    <w:p>
+      <w:pPr>
+        <w:spacing w:after="160" w:line="360"/>
+      </w:pPr>
+      <w:r>
+        <w:t xml:space="preserve">Figure 1 maps each category to the six CSF 2.0 functions. No tool spans the framework or addresses Govern, so tools complement, rather than replace, baseline controls such as ASD’s Essential Eight, including multi-factor authentication (MFA; ASD, 2023).</w:t>
       </w:r>
     </w:p>
     <w:p>
@@ -1535,7 +1535,7 @@
         <w:spacing w:after="160" w:line="360"/>
       </w:pPr>
       <w:r>
-        <w:t xml:space="preserve">NIST SP 800-61 Revision 3 reframes incident response as a continuous part of risk management rather than a separate, one-off activity (Nelson et al., 2025). Appraised against its phases, the tools play complementary roles. For </w:t>
+        <w:t xml:space="preserve">NIST SP 800-61 Revision 3 treats incident response as a continuous part of risk management rather than a one-off activity (Nelson et al., 2025). For </w:t>
       </w:r>
       <w:r>
         <w:rPr>
@@ -1545,7 +1545,7 @@
         <w:t xml:space="preserve">detection</w:t>
       </w:r>
       <w:r>
-        <w:t xml:space="preserve">, SIEM correlation across identity, network and endpoint data is strongest, while EDR provides the earliest endpoint signal. Medibank shows that detection depends on people and process as much as technology: the Office of the Australian Information Commissioner (OAIC) alleges that Medibank’s EDR software generated alerts on 24–25 August 2022 that were not appropriately triaged or escalated (OAIC, 2024). For </w:t>
+        <w:t xml:space="preserve">, SIEM correlation across identity, network and endpoint data is strongest, while EDR gives the earliest endpoint signal. Yet detection depends on process as much as technology: the Office of the Australian Information Commissioner (OAIC) alleges that Medibank’s EDR software generated alerts on 24–25 August 2022 that were not appropriately triaged or escalated (OAIC, 2024). For </w:t>
       </w:r>
       <w:r>
         <w:rPr>
@@ -1555,7 +1555,7 @@
         <w:t xml:space="preserve">containment</w:t>
       </w:r>
       <w:r>
-        <w:t xml:space="preserve">, EDR host isolation and credential revocation are the fastest levers, but they depend on authority to act quickly; pre-approved containment playbooks, which SP 800-61r3 encourages, shorten the delay between detection and action. For </w:t>
+        <w:t xml:space="preserve">, EDR host isolation and credential revocation are the fastest levers, provided pre-approved playbooks give staff authority to act. For </w:t>
       </w:r>
       <w:r>
         <w:rPr>
@@ -1565,7 +1565,7 @@
         <w:t xml:space="preserve">eradication</w:t>
       </w:r>
       <w:r>
-        <w:t xml:space="preserve">, DFIR analysis is essential to find persistence mechanisms and confirm root cause; without it, attackers may return. For </w:t>
+        <w:t xml:space="preserve">, DFIR analysis finds persistence mechanisms and confirms root cause. For </w:t>
       </w:r>
       <w:r>
         <w:rPr>
@@ -1575,7 +1575,7 @@
         <w:t xml:space="preserve">recovery</w:t>
       </w:r>
       <w:r>
-        <w:t xml:space="preserve">, forensic scoping determines who must be notified. At Latitude, the reported number of affected records rose from about 328,000 to around 14 million as the investigation progressed (SecurityWeek, 2023). This illustrates, in my analysis, how difficult scoping becomes when legacy data is retained.</w:t>
+        <w:t xml:space="preserve">, forensic scoping determines who must be notified: Latitude’s reported figure rose from about 328,000 to around 14 million records as the investigation progressed (SecurityWeek, 2023), which, in my analysis, shows how retained legacy data complicates scoping.</w:t>
       </w:r>
     </w:p>
     <w:p>
@@ -1591,7 +1591,7 @@
         <w:spacing w:after="160" w:line="360"/>
       </w:pPr>
       <w:r>
-        <w:t xml:space="preserve">Table 2 separates documented facts from this report’s analysis. In none of the three cases does the public record show that the absence of a tool was the primary cause; the documented failures relate to asset visibility, identity controls and alert handling.</w:t>
+        <w:t xml:space="preserve">Table 2 separates documented facts from this report’s analysis. In none of the three cases does the public record show that a missing tool was the primary cause.</w:t>
       </w:r>
     </w:p>
     <w:p>
@@ -2030,7 +2030,7 @@
         <w:t xml:space="preserve">Optus</w:t>
       </w:r>
       <w:r>
-        <w:t xml:space="preserve">, the Australian Communications and Media Authority (ACMA) alleges that a 2018 coding error left access controls on a dormant, internet-facing API ineffective, and that the error was fixed on the main domain but not on the subdomain hosting the API (iTnews, 2024). The OAIC alleges that around 9.5 million Australians were affected (OAIC, 2025). In my analysis, this was primarily an Identify and Protect failure: an accurate inventory of internet-facing assets and API security testing would probably have found the endpoint, while SIEM analysis of API request volumes could have flagged bulk data harvesting. At </w:t>
+        <w:t xml:space="preserve">, the Australian Communications and Media Authority (ACMA) alleges that a 2018 coding error left access controls on a dormant, internet-facing API ineffective, and that it was fixed on the main domain but not the subdomain (iTnews, 2024); around 9.5 million Australians were allegedly affected (OAIC, 2025). In my analysis, this was an Identify and Protect failure: an inventory of internet-facing assets and API testing would probably have found the endpoint, and SIEM monitoring of request volumes could have flagged bulk harvesting. At </w:t>
       </w:r>
       <w:r>
         <w:rPr>
@@ -2040,7 +2040,7 @@
         <w:t xml:space="preserve">Medibank</w:t>
       </w:r>
       <w:r>
-        <w:t xml:space="preserve">, the documented sequence (credentials stolen from a contractor, VPN access without MFA, untriaged EDR alerts, and about 520 GB extracted before high-severity triage on 11 October 2022) shows that detection technology generated signals that the organisation did not act on (OAIC, 2024). Enforced MFA and assured 24/7 triage would, in my view, have broken this chain earlier. At </w:t>
+        <w:t xml:space="preserve">, stolen contractor credentials, VPN access without MFA and untriaged alerts preceded the extraction of about 520 GB of data (OAIC, 2024); enforced MFA and assured 24/7 triage would, in my view, have broken this chain much earlier. At </w:t>
       </w:r>
       <w:r>
         <w:rPr>
@@ -2050,7 +2050,7 @@
         <w:t xml:space="preserve">Latitude</w:t>
       </w:r>
       <w:r>
-        <w:t xml:space="preserve">, attackers used credentials obtained through a major vendor, and the breach cost about $76 million (ACS Information Age, 2023). Public technical detail is limited and the OAIC investigation continues, so conclusions are tentative; identity analytics on third-party accounts and data minimisation appear the most relevant capabilities.</w:t>
+        <w:t xml:space="preserve">, attackers used credentials obtained through a major vendor, at a cost of about $76 million (ACS Information Age, 2023). Public detail is limited and the OAIC investigation continues, so conclusions are tentative, but third-party identity analytics and data minimisation appear the most relevant capabilities.</w:t>
       </w:r>
     </w:p>
     <w:p>
@@ -2066,7 +2066,7 @@
         <w:spacing w:after="160" w:line="360"/>
       </w:pPr>
       <w:r>
-        <w:t xml:space="preserve">Four trends will shape investigation practice. First, ASD (2025) reports AI-enabled scams alongside rising incident volumes; AI-assisted triage may reduce alert fatigue, but its outputs must be explainable if they are to support evidence. Second, credential and third-party compromise, seen at both Medibank and Latitude, shifts investigation towards identity and SaaS audit logs, which often have short default retention. Third, regulation is raising the stakes: ransomware payments must be reported within 72 hours under the </w:t>
+        <w:t xml:space="preserve">Four trends will shape investigation practice. First, ASD (2025) reports AI-enabled scams; AI-assisted triage may ease alert fatigue, but its outputs must be explainable to serve as evidence. Second, credential and third-party compromise, seen at Medibank and Latitude, shifts investigation towards identity and SaaS audit logs, which often have short retention. Third, regulation raises the stakes: ransomware payments must be reported within 72 hours under the </w:t>
       </w:r>
       <w:r>
         <w:rPr>
@@ -2076,7 +2076,7 @@
         <w:t xml:space="preserve">Cyber Security Act 2024</w:t>
       </w:r>
       <w:r>
-        <w:t xml:space="preserve"> (Cth) from 30 May 2025 (Department of Home Affairs, 2025), and a statutory tort for serious invasions of privacy commenced on 10 June 2025 under the </w:t>
+        <w:t xml:space="preserve"> (Cth) (Department of Home Affairs, 2025), and a statutory privacy tort commenced in June 2025 under the </w:t>
       </w:r>
       <w:r>
         <w:rPr>
@@ -2086,7 +2086,7 @@
         <w:t xml:space="preserve">Privacy and Other Legislation Amendment Act 2024</w:t>
       </w:r>
       <w:r>
-        <w:t xml:space="preserve"> (Cth). Investigations must therefore be both fast and legally defensible, as recent court disputes over access to Medibank’s post-breach forensic reports illustrate (Herbert Smith Freehills Kramer, 2025). Fourth, persistent skills shortages favour managed detection and response (MDR) services.</w:t>
+        <w:t xml:space="preserve"> (Cth). Investigations must therefore be legally defensible, as disputes over Medibank’s forensic reports show (Herbert Smith Freehills Kramer, 2025). Fourth, skills shortages favour managed detection and response (MDR) services.</w:t>
       </w:r>
     </w:p>
     <w:p>
@@ -2102,7 +2102,7 @@
         <w:spacing w:after="160" w:line="360"/>
       </w:pPr>
       <w:r>
-        <w:t xml:space="preserve">The appraisal indicates that the "best fit" is not a single product but an integrated, maturity-based capability governed under the CSF 2.0 Govern function. For Australian organisations, four prioritised recommendations follow:</w:t>
+        <w:t xml:space="preserve">The “best fit” is not a single product but an integrated, maturity-based capability governed under the CSF 2.0 Govern function. Four prioritised recommendations follow for Australian organisations:</w:t>
       </w:r>
     </w:p>
     <w:p>
@@ -2121,7 +2121,7 @@
         <w:t xml:space="preserve">Fix fundamentals and alert ownership (0–3 months).</w:t>
       </w:r>
       <w:r>
-        <w:t xml:space="preserve"> Enforce phishing-resistant MFA on all remote access, in line with the Essential Eight, and assign 24/7 alert triage with defined escalation times, in-house or through MDR. This addresses the Medibank failure pattern.</w:t>
+        <w:t xml:space="preserve"> Enforce phishing-resistant MFA on all remote access and assign 24/7 alert triage, in-house or through MDR. This addresses the Medibank pattern.</w:t>
       </w:r>
     </w:p>
     <w:p>
@@ -2140,7 +2140,7 @@
         <w:t xml:space="preserve">Integrate SIEM with EDR/XDR (3–9 months).</w:t>
       </w:r>
       <w:r>
-        <w:t xml:space="preserve"> Centralise identity, API, cloud and endpoint logs to ASD’s baseline (ASD’s ACSC et al., 2024), with tuned use cases for credential misuse and bulk data access. This addresses the Optus and Latitude patterns.</w:t>
+        <w:t xml:space="preserve"> Centralise identity, API, cloud and endpoint logs to ASD’s baseline (ASD’s ACSC et al., 2024), addressing the Optus and Latitude patterns.</w:t>
       </w:r>
     </w:p>
     <w:p>
@@ -2159,7 +2159,7 @@
         <w:t xml:space="preserve">Build forensic readiness (6–12 months).</w:t>
       </w:r>
       <w:r>
-        <w:t xml:space="preserve"> Hold a DFIR retainer, set log retention to support scoping, and rehearse SP 800-61r3-aligned playbooks.</w:t>
+        <w:t xml:space="preserve"> Hold a DFIR retainer, extend log retention and rehearse SP 800-61r3-aligned playbooks.</w:t>
       </w:r>
     </w:p>
     <w:p>
@@ -2178,15 +2178,15 @@
         <w:t xml:space="preserve">Add threat intelligence last (12+ months).</w:t>
       </w:r>
       <w:r>
-        <w:t xml:space="preserve"> Introduce a TIP only once triage is mature, feeding it into risk assessment.</w:t>
-      </w:r>
-    </w:p>
-    <w:p>
-      <w:pPr>
-        <w:spacing w:after="160" w:line="360"/>
-      </w:pPr>
-      <w:r>
-        <w:t xml:space="preserve">Together with data minimisation, these steps align tools with risk rather than with vendor promises. Quantifying loss exposure with FAIR (Freund &amp; Jones, 2015) would further help boards prioritise this investment.</w:t>
+        <w:t xml:space="preserve"> Introduce a TIP only once triage is mature.</w:t>
+      </w:r>
+    </w:p>
+    <w:p>
+      <w:pPr>
+        <w:spacing w:after="160" w:line="360"/>
+      </w:pPr>
+      <w:r>
+        <w:t xml:space="preserve">Combined with data minimisation and FAIR-based loss quantification (Freund &amp; Jones, 2015), these steps align investment with risk rather than vendor promises.</w:t>
       </w:r>
     </w:p>
     <w:p>

</xml_diff>